<commit_message>
Added RAM test overview
</commit_message>
<xml_diff>
--- a/Manual/TKGTestROMManual.docx
+++ b/Manual/TKGTestROMManual.docx
@@ -414,27 +414,7 @@
               </w:rPr>
               <w:t>ROM Checksums</w:t>
               <w:tab/>
-              <w:t>5</w:t>
-            </w:r>
-          </w:hyperlink>
-        </w:p>
-        <w:p>
-          <w:pPr>
-            <w:pStyle w:val="TOC3"/>
-            <w:tabs>
-              <w:tab w:val="clear" w:pos="9972"/>
-              <w:tab w:val="right" w:pos="9971" w:leader="dot"/>
-            </w:tabs>
-            <w:rPr/>
-          </w:pPr>
-          <w:hyperlink w:anchor="__RefHeading___Toc818_1351480008" w:tooltip="Test Overview">
-            <w:r>
-              <w:rPr>
-                <w:rStyle w:val="IndexLink"/>
-              </w:rPr>
-              <w:t>Test Overview</w:t>
-              <w:tab/>
-              <w:t>5</w:t>
+              <w:t>6</w:t>
             </w:r>
           </w:hyperlink>
         </w:p>
@@ -514,7 +494,7 @@
               </w:rPr>
               <w:t>DMA Test</w:t>
               <w:tab/>
-              <w:t>6</w:t>
+              <w:t>7</w:t>
             </w:r>
           </w:hyperlink>
         </w:p>
@@ -554,7 +534,7 @@
               </w:rPr>
               <w:t>Audio Tests</w:t>
               <w:tab/>
-              <w:t>7</w:t>
+              <w:t>8</w:t>
             </w:r>
           </w:hyperlink>
         </w:p>
@@ -1404,6 +1384,52 @@
     </w:p>
     <w:p>
       <w:pPr>
+        <w:pStyle w:val="BodyText"/>
+        <w:bidi w:val="0"/>
+        <w:ind w:hanging="0" w:start="0"/>
+        <w:jc w:val="start"/>
+        <w:rPr/>
+      </w:pPr>
+      <w:r>
+        <w:rPr/>
+        <w:t>There are two different sections of RAM tests: RAM test and RAM bank test. The RAM test tests the individual RAM chips themselves. The RAM bank test (labeled B. Test) which tests the addressing of the RAM test. There are five total banks of RAM ICs. Each bank consists of a pair of two 4-bit RAM chips designated high and low where high is the more significant nibble and low is the less significant nibble. The RAM tests are the first tests that run on the system as they need to be run without using RAM for itself.</w:t>
+      </w:r>
+    </w:p>
+    <w:p>
+      <w:pPr>
+        <w:pStyle w:val="BodyText"/>
+        <w:bidi w:val="0"/>
+        <w:ind w:hanging="0" w:start="0"/>
+        <w:jc w:val="start"/>
+        <w:rPr>
+          <w:i/>
+          <w:iCs/>
+        </w:rPr>
+      </w:pPr>
+      <w:r>
+        <w:rPr>
+          <w:i/>
+          <w:iCs/>
+        </w:rPr>
+        <w:t xml:space="preserve">Please note: When the RAM test is running you may say “garbage” on the screen. The reason for this is that </w:t>
+      </w:r>
+      <w:r>
+        <w:rPr>
+          <w:i/>
+          <w:iCs/>
+        </w:rPr>
+        <w:t xml:space="preserve">video and sprite RAM is tested. Whenever data is written to those areas it will </w:t>
+      </w:r>
+      <w:r>
+        <w:rPr>
+          <w:i/>
+          <w:iCs/>
+        </w:rPr>
+        <w:t>appear on the screen automatically. There is no video blanking/supression that can be controlled via software.</w:t>
+      </w:r>
+    </w:p>
+    <w:p>
+      <w:pPr>
         <w:pStyle w:val="Heading3"/>
         <w:numPr>
           <w:ilvl w:val="0"/>
@@ -1418,7 +1444,11 @@
       <w:bookmarkEnd w:id="7"/>
       <w:r>
         <w:rPr/>
-        <w:t>RAM Tests</w:t>
+        <w:t xml:space="preserve">RAM </w:t>
+      </w:r>
+      <w:r>
+        <w:rPr/>
+        <w:t>IC Tests</w:t>
       </w:r>
     </w:p>
     <w:p>
@@ -3607,8 +3637,8 @@
       <w:pPr>
         <w:pStyle w:val="Heading3"/>
         <w:numPr>
-          <w:ilvl w:val="2"/>
-          <w:numId w:val="2"/>
+          <w:ilvl w:val="0"/>
+          <w:numId w:val="0"/>
         </w:numPr>
         <w:bidi w:val="0"/>
         <w:ind w:hanging="0" w:start="0"/>
@@ -4703,6 +4733,18 @@
     </w:p>
     <w:p>
       <w:pPr>
+        <w:pStyle w:val="BodyText"/>
+        <w:bidi w:val="0"/>
+        <w:jc w:val="start"/>
+        <w:rPr/>
+      </w:pPr>
+      <w:r>
+        <w:rPr/>
+        <w:t>The ROM test performs a 16-bit checksum on the contents of all ROMs. This test does not report the integrity of the ROMs nor does it validate that it is correct for a location. That is up to the user to determine. The exception to this is ROM 0, which is where the test ROM is located.</w:t>
+      </w:r>
+    </w:p>
+    <w:p>
+      <w:pPr>
         <w:pStyle w:val="Heading3"/>
         <w:numPr>
           <w:ilvl w:val="2"/>
@@ -4713,39 +4755,8 @@
         <w:jc w:val="start"/>
         <w:rPr/>
       </w:pPr>
-      <w:bookmarkStart w:id="13" w:name="__RefHeading___Toc818_1351480008"/>
+      <w:bookmarkStart w:id="13" w:name="__RefHeading___Toc820_1351480008"/>
       <w:bookmarkEnd w:id="13"/>
-      <w:r>
-        <w:rPr/>
-        <w:t>Test Overview</w:t>
-      </w:r>
-    </w:p>
-    <w:p>
-      <w:pPr>
-        <w:pStyle w:val="BodyText"/>
-        <w:bidi w:val="0"/>
-        <w:jc w:val="start"/>
-        <w:rPr/>
-      </w:pPr>
-      <w:r>
-        <w:rPr/>
-        <w:t>The ROM test performs a 16-bit checksum on the contents of all ROMs. This test does not report the integrity of the ROMs nor does it validate that it is correct for a location. That is up to the user to determine. The exception to this is ROM 0, which is where the test ROM is located.</w:t>
-      </w:r>
-    </w:p>
-    <w:p>
-      <w:pPr>
-        <w:pStyle w:val="Heading3"/>
-        <w:numPr>
-          <w:ilvl w:val="2"/>
-          <w:numId w:val="2"/>
-        </w:numPr>
-        <w:bidi w:val="0"/>
-        <w:ind w:hanging="0" w:start="0"/>
-        <w:jc w:val="start"/>
-        <w:rPr/>
-      </w:pPr>
-      <w:bookmarkStart w:id="14" w:name="__RefHeading___Toc820_1351480008"/>
-      <w:bookmarkEnd w:id="14"/>
       <w:r>
         <w:rPr/>
         <w:t>Test ROM Integrity Test</w:t>
@@ -4835,8 +4846,8 @@
         <w:ind w:hanging="0" w:start="0"/>
         <w:rPr/>
       </w:pPr>
-      <w:bookmarkStart w:id="15" w:name="__RefHeading___Toc1548_1351480008"/>
-      <w:bookmarkEnd w:id="15"/>
+      <w:bookmarkStart w:id="14" w:name="__RefHeading___Toc1548_1351480008"/>
+      <w:bookmarkEnd w:id="14"/>
       <w:r>
         <w:rPr/>
         <w:t>ROM Locations</w:t>
@@ -5543,8 +5554,8 @@
         <w:jc w:val="start"/>
         <w:rPr/>
       </w:pPr>
-      <w:bookmarkStart w:id="16" w:name="__RefHeading___Toc822_1351480008"/>
-      <w:bookmarkEnd w:id="16"/>
+      <w:bookmarkStart w:id="15" w:name="__RefHeading___Toc822_1351480008"/>
+      <w:bookmarkEnd w:id="15"/>
       <w:r>
         <w:rPr/>
         <w:t>ROM Checksum Table</w:t>
@@ -6398,8 +6409,8 @@
         <w:jc w:val="start"/>
         <w:rPr/>
       </w:pPr>
-      <w:bookmarkStart w:id="17" w:name="__RefHeading___Toc221_1351480008"/>
-      <w:bookmarkEnd w:id="17"/>
+      <w:bookmarkStart w:id="16" w:name="__RefHeading___Toc221_1351480008"/>
+      <w:bookmarkEnd w:id="16"/>
       <w:r>
         <w:rPr/>
         <w:t>DMA Test</w:t>
@@ -6415,7 +6426,7 @@
       </w:pPr>
       <w:r>
         <w:rPr/>
-        <w:t>TKG hardware relies heavily on DMA to transfer data from work RAM to sprite RAM. During gameplay it is triggered during the NMI routine. The reason for this is because this is when vertical blanking (also known as VBlank) is occuring, meaning that nothing is being drawn on screen. VBlank occurs sixty times per second. On TKG hardware, an 8257 DMA controller is used to perform these operations as well as some supporting circuitry. On TKG4 hardware, that circuitry includes the 74LS373 octal latch at 6B, the 74ls08 quad and-gate at 5F, and the 74LS125 buffer at 6E. The 8257 derives its clock from the 1H signal (~3MHz). Unlike the CPU clock however, it goes through an inverter (74LS04 at 6D). Chip select circuitry is also involved. Refer to the schematics to find out more.</w:t>
+        <w:t>TKG hardware relies heavily on DMA to transfer data from work RAM to sprite RAM. During gameplay it is triggered during the NMI routine. The reason for this is because this is when vertical blanking (also known as VBlank) is occurring, meaning that nothing is being drawn on screen. VBlank occurs sixty times per second. On TKG hardware, an 8257 DMA controller is used to perform these operations as well as some supporting circuitry. On TKG4 hardware, that circuitry includes the 74LS373 octal latch at 6B, the 74ls08 quad and-gate at 5F, and the 74LS125 buffer at 6E. The 8257 derives its clock from the 1H signal (~3MHz). Unlike the CPU clock however, it goes through an inverter (74LS04 at 6D). Chip select circuitry is also involved. Refer to the schematics to find out more.</w:t>
       </w:r>
     </w:p>
     <w:p>
@@ -6456,8 +6467,8 @@
         <w:jc w:val="start"/>
         <w:rPr/>
       </w:pPr>
-      <w:bookmarkStart w:id="18" w:name="__RefHeading___Toc223_1351480008"/>
-      <w:bookmarkEnd w:id="18"/>
+      <w:bookmarkStart w:id="17" w:name="__RefHeading___Toc223_1351480008"/>
+      <w:bookmarkEnd w:id="17"/>
       <w:r>
         <w:rPr/>
         <w:t>NMI Test</w:t>
@@ -6513,8 +6524,8 @@
         <w:jc w:val="start"/>
         <w:rPr/>
       </w:pPr>
-      <w:bookmarkStart w:id="19" w:name="__RefHeading___Toc225_1351480008"/>
-      <w:bookmarkEnd w:id="19"/>
+      <w:bookmarkStart w:id="18" w:name="__RefHeading___Toc225_1351480008"/>
+      <w:bookmarkEnd w:id="18"/>
       <w:r>
         <w:rPr/>
         <w:t>Audio Tests</w:t>
@@ -6603,8 +6614,8 @@
         <w:jc w:val="start"/>
         <w:rPr/>
       </w:pPr>
-      <w:bookmarkStart w:id="20" w:name="__RefHeading___Toc824_1351480008"/>
-      <w:bookmarkEnd w:id="20"/>
+      <w:bookmarkStart w:id="19" w:name="__RefHeading___Toc824_1351480008"/>
+      <w:bookmarkEnd w:id="19"/>
       <w:r>
         <w:rPr/>
         <w:t>Transition to Runtime</w:t>
@@ -6644,8 +6655,8 @@
         <w:jc w:val="start"/>
         <w:rPr/>
       </w:pPr>
-      <w:bookmarkStart w:id="21" w:name="__RefHeading___Toc231_1351480008"/>
-      <w:bookmarkEnd w:id="21"/>
+      <w:bookmarkStart w:id="20" w:name="__RefHeading___Toc231_1351480008"/>
+      <w:bookmarkEnd w:id="20"/>
       <w:r>
         <w:rPr/>
         <w:t>Chapter 3: Runtime Tests</w:t>
@@ -6663,8 +6674,8 @@
         <w:jc w:val="start"/>
         <w:rPr/>
       </w:pPr>
-      <w:bookmarkStart w:id="22" w:name="__RefHeading___Toc826_1351480008"/>
-      <w:bookmarkEnd w:id="22"/>
+      <w:bookmarkStart w:id="21" w:name="__RefHeading___Toc826_1351480008"/>
+      <w:bookmarkEnd w:id="21"/>
       <w:r>
         <w:rPr/>
         <w:t>Controls Test</w:t>
@@ -6761,8 +6772,8 @@
         <w:jc w:val="start"/>
         <w:rPr/>
       </w:pPr>
-      <w:bookmarkStart w:id="23" w:name="__RefHeading___Toc828_1351480008"/>
-      <w:bookmarkEnd w:id="23"/>
+      <w:bookmarkStart w:id="22" w:name="__RefHeading___Toc828_1351480008"/>
+      <w:bookmarkEnd w:id="22"/>
       <w:r>
         <w:rPr/>
         <w:t>DIP Switch Test</w:t>
@@ -6901,8 +6912,8 @@
         <w:jc w:val="start"/>
         <w:rPr/>
       </w:pPr>
-      <w:bookmarkStart w:id="24" w:name="__RefHeading___Toc830_1351480008"/>
-      <w:bookmarkEnd w:id="24"/>
+      <w:bookmarkStart w:id="23" w:name="__RefHeading___Toc830_1351480008"/>
+      <w:bookmarkEnd w:id="23"/>
       <w:r>
         <w:rPr/>
         <w:t>Palette Test</w:t>
@@ -6933,8 +6944,8 @@
         <w:jc w:val="start"/>
         <w:rPr/>
       </w:pPr>
-      <w:bookmarkStart w:id="25" w:name="__RefHeading___Toc832_1351480008"/>
-      <w:bookmarkEnd w:id="25"/>
+      <w:bookmarkStart w:id="24" w:name="__RefHeading___Toc832_1351480008"/>
+      <w:bookmarkEnd w:id="24"/>
       <w:r>
         <w:rPr/>
         <w:t>Screen Invert</w:t>
@@ -7259,8 +7270,8 @@
         <w:jc w:val="start"/>
         <w:rPr/>
       </w:pPr>
-      <w:bookmarkStart w:id="26" w:name="__RefHeading___Toc834_1351480008"/>
-      <w:bookmarkEnd w:id="26"/>
+      <w:bookmarkStart w:id="25" w:name="__RefHeading___Toc834_1351480008"/>
+      <w:bookmarkEnd w:id="25"/>
       <w:r>
         <w:rPr/>
         <w:t>Monitor Test</w:t>
@@ -7278,8 +7289,8 @@
         <w:jc w:val="start"/>
         <w:rPr/>
       </w:pPr>
-      <w:bookmarkStart w:id="27" w:name="__RefHeading___Toc836_1351480008"/>
-      <w:bookmarkEnd w:id="27"/>
+      <w:bookmarkStart w:id="26" w:name="__RefHeading___Toc836_1351480008"/>
+      <w:bookmarkEnd w:id="26"/>
       <w:r>
         <w:rPr/>
         <w:t>Sound Test</w:t>
@@ -7297,8 +7308,8 @@
         <w:jc w:val="start"/>
         <w:rPr/>
       </w:pPr>
-      <w:bookmarkStart w:id="28" w:name="__RefHeading___Toc838_1351480008"/>
-      <w:bookmarkEnd w:id="28"/>
+      <w:bookmarkStart w:id="27" w:name="__RefHeading___Toc838_1351480008"/>
+      <w:bookmarkEnd w:id="27"/>
       <w:r>
         <w:rPr/>
         <w:t>Music Test</w:t>
@@ -7316,8 +7327,8 @@
         <w:jc w:val="start"/>
         <w:rPr/>
       </w:pPr>
-      <w:bookmarkStart w:id="29" w:name="__RefHeading___Toc840_1351480008"/>
-      <w:bookmarkEnd w:id="29"/>
+      <w:bookmarkStart w:id="28" w:name="__RefHeading___Toc840_1351480008"/>
+      <w:bookmarkEnd w:id="28"/>
       <w:r>
         <w:rPr/>
         <w:t>Background Test</w:t>
@@ -7335,8 +7346,8 @@
         <w:jc w:val="start"/>
         <w:rPr/>
       </w:pPr>
-      <w:bookmarkStart w:id="30" w:name="__RefHeading___Toc842_1351480008"/>
-      <w:bookmarkEnd w:id="30"/>
+      <w:bookmarkStart w:id="29" w:name="__RefHeading___Toc842_1351480008"/>
+      <w:bookmarkEnd w:id="29"/>
       <w:r>
         <w:rPr/>
         <w:t>Sprite Test</w:t>
@@ -7354,8 +7365,8 @@
         <w:jc w:val="start"/>
         <w:rPr/>
       </w:pPr>
-      <w:bookmarkStart w:id="31" w:name="__RefHeading___Toc844_1351480008"/>
-      <w:bookmarkEnd w:id="31"/>
+      <w:bookmarkStart w:id="30" w:name="__RefHeading___Toc844_1351480008"/>
+      <w:bookmarkEnd w:id="30"/>
       <w:r>
         <w:rPr/>
         <w:t>Reset</w:t>
@@ -7412,8 +7423,8 @@
         <w:jc w:val="start"/>
         <w:rPr/>
       </w:pPr>
-      <w:bookmarkStart w:id="32" w:name="__RefHeading___Toc233_1351480008"/>
-      <w:bookmarkEnd w:id="32"/>
+      <w:bookmarkStart w:id="31" w:name="__RefHeading___Toc233_1351480008"/>
+      <w:bookmarkEnd w:id="31"/>
       <w:r>
         <w:rPr/>
         <w:t>Chapter 4: Test Architectures</w:t>
@@ -7450,8 +7461,8 @@
         <w:ind w:hanging="0" w:start="0"/>
         <w:rPr/>
       </w:pPr>
-      <w:bookmarkStart w:id="33" w:name="__RefHeading___Toc915_2335499624"/>
-      <w:bookmarkEnd w:id="33"/>
+      <w:bookmarkStart w:id="32" w:name="__RefHeading___Toc915_2335499624"/>
+      <w:bookmarkEnd w:id="32"/>
       <w:r>
         <w:rPr/>
         <w:t>Abbreviations</w:t>
@@ -7710,7 +7721,7 @@
       <w:tab/>
       <w:tab/>
     </w:r>
-    <w:bookmarkStart w:id="34" w:name="PageNumWizard_FOOTER_Default_Page_Style3"/>
+    <w:bookmarkStart w:id="33" w:name="PageNumWizard_FOOTER_Default_Page_Style3"/>
     <w:r>
       <w:rPr/>
       <w:fldChar w:fldCharType="begin"/>
@@ -7731,7 +7742,7 @@
       <w:rPr/>
       <w:fldChar w:fldCharType="end"/>
     </w:r>
-    <w:bookmarkEnd w:id="34"/>
+    <w:bookmarkEnd w:id="33"/>
   </w:p>
 </w:ftr>
 </file>

</xml_diff>

<commit_message>
Finished first draft of the startup tests
</commit_message>
<xml_diff>
--- a/Manual/TKGTestROMManual.docx
+++ b/Manual/TKGTestROMManual.docx
@@ -307,12 +307,12 @@
             </w:tabs>
             <w:rPr/>
           </w:pPr>
-          <w:hyperlink w:anchor="__RefHeading___Toc808_1351480008" w:tooltip="RAM Tests">
+          <w:hyperlink w:anchor="__RefHeading___Toc808_1351480008" w:tooltip="RAM IC Tests">
             <w:r>
               <w:rPr>
                 <w:rStyle w:val="IndexLink"/>
               </w:rPr>
-              <w:t>RAM Tests</w:t>
+              <w:t>RAM IC Tests</w:t>
               <w:tab/>
               <w:t>5</w:t>
             </w:r>
@@ -347,6 +347,46 @@
             </w:tabs>
             <w:rPr/>
           </w:pPr>
+          <w:hyperlink w:anchor="__RefHeading___Toc3936_33709793" w:tooltip="Brief Explaination of RAM Functionality">
+            <w:r>
+              <w:rPr>
+                <w:rStyle w:val="IndexLink"/>
+              </w:rPr>
+              <w:t>Brief Explaination of RAM Functionality</w:t>
+              <w:tab/>
+              <w:t>5</w:t>
+            </w:r>
+          </w:hyperlink>
+        </w:p>
+        <w:p>
+          <w:pPr>
+            <w:pStyle w:val="TOC3"/>
+            <w:tabs>
+              <w:tab w:val="clear" w:pos="9972"/>
+              <w:tab w:val="right" w:pos="9971" w:leader="dot"/>
+            </w:tabs>
+            <w:rPr/>
+          </w:pPr>
+          <w:hyperlink w:anchor="__RefHeading___Toc3938_33709793" w:tooltip="RAM Failure Tones">
+            <w:r>
+              <w:rPr>
+                <w:rStyle w:val="IndexLink"/>
+              </w:rPr>
+              <w:t>RAM Failure Tones</w:t>
+              <w:tab/>
+              <w:t>6</w:t>
+            </w:r>
+          </w:hyperlink>
+        </w:p>
+        <w:p>
+          <w:pPr>
+            <w:pStyle w:val="TOC3"/>
+            <w:tabs>
+              <w:tab w:val="clear" w:pos="9972"/>
+              <w:tab w:val="right" w:pos="9971" w:leader="dot"/>
+            </w:tabs>
+            <w:rPr/>
+          </w:pPr>
           <w:hyperlink w:anchor="__RefHeading___Toc812_1351480008" w:tooltip="TRS2 and TKG2 RAM Locations">
             <w:r>
               <w:rPr>
@@ -354,7 +394,7 @@
               </w:rPr>
               <w:t>TRS2 and TKG2 RAM Locations</w:t>
               <w:tab/>
-              <w:t>5</w:t>
+              <w:t>6</w:t>
             </w:r>
           </w:hyperlink>
         </w:p>
@@ -374,7 +414,7 @@
               </w:rPr>
               <w:t>TKG3 RAM Locations</w:t>
               <w:tab/>
-              <w:t>5</w:t>
+              <w:t>6</w:t>
             </w:r>
           </w:hyperlink>
         </w:p>
@@ -394,7 +434,7 @@
               </w:rPr>
               <w:t>TKG4 RAM Locations</w:t>
               <w:tab/>
-              <w:t>5</w:t>
+              <w:t>6</w:t>
             </w:r>
           </w:hyperlink>
         </w:p>
@@ -414,7 +454,7 @@
               </w:rPr>
               <w:t>ROM Checksums</w:t>
               <w:tab/>
-              <w:t>6</w:t>
+              <w:t>7</w:t>
             </w:r>
           </w:hyperlink>
         </w:p>
@@ -434,7 +474,7 @@
               </w:rPr>
               <w:t>Test ROM Integrity Test</w:t>
               <w:tab/>
-              <w:t>6</w:t>
+              <w:t>7</w:t>
             </w:r>
           </w:hyperlink>
         </w:p>
@@ -454,7 +494,7 @@
               </w:rPr>
               <w:t>ROM Locations</w:t>
               <w:tab/>
-              <w:t>6</w:t>
+              <w:t>7</w:t>
             </w:r>
           </w:hyperlink>
         </w:p>
@@ -474,7 +514,7 @@
               </w:rPr>
               <w:t>ROM Checksum Table</w:t>
               <w:tab/>
-              <w:t>6</w:t>
+              <w:t>7</w:t>
             </w:r>
           </w:hyperlink>
         </w:p>
@@ -494,7 +534,7 @@
               </w:rPr>
               <w:t>DMA Test</w:t>
               <w:tab/>
-              <w:t>7</w:t>
+              <w:t>8</w:t>
             </w:r>
           </w:hyperlink>
         </w:p>
@@ -514,7 +554,7 @@
               </w:rPr>
               <w:t>NMI Test</w:t>
               <w:tab/>
-              <w:t>7</w:t>
+              <w:t>8</w:t>
             </w:r>
           </w:hyperlink>
         </w:p>
@@ -534,7 +574,7 @@
               </w:rPr>
               <w:t>Audio Tests</w:t>
               <w:tab/>
-              <w:t>8</w:t>
+              <w:t>9</w:t>
             </w:r>
           </w:hyperlink>
         </w:p>
@@ -554,7 +594,7 @@
               </w:rPr>
               <w:t>Transition to Runtime</w:t>
               <w:tab/>
-              <w:t>8</w:t>
+              <w:t>9</w:t>
             </w:r>
           </w:hyperlink>
         </w:p>
@@ -574,7 +614,7 @@
               </w:rPr>
               <w:t>Chapter 3: Runtime Tests</w:t>
               <w:tab/>
-              <w:t>9</w:t>
+              <w:t>10</w:t>
             </w:r>
           </w:hyperlink>
         </w:p>
@@ -594,7 +634,7 @@
               </w:rPr>
               <w:t>Controls Test</w:t>
               <w:tab/>
-              <w:t>9</w:t>
+              <w:t>10</w:t>
             </w:r>
           </w:hyperlink>
         </w:p>
@@ -614,7 +654,7 @@
               </w:rPr>
               <w:t>DIP Switch Test</w:t>
               <w:tab/>
-              <w:t>9</w:t>
+              <w:t>10</w:t>
             </w:r>
           </w:hyperlink>
         </w:p>
@@ -634,7 +674,7 @@
               </w:rPr>
               <w:t>Palette Test</w:t>
               <w:tab/>
-              <w:t>10</w:t>
+              <w:t>11</w:t>
             </w:r>
           </w:hyperlink>
         </w:p>
@@ -654,7 +694,7 @@
               </w:rPr>
               <w:t>Screen Invert</w:t>
               <w:tab/>
-              <w:t>10</w:t>
+              <w:t>11</w:t>
             </w:r>
           </w:hyperlink>
         </w:p>
@@ -674,7 +714,7 @@
               </w:rPr>
               <w:t>Monitor Test</w:t>
               <w:tab/>
-              <w:t>11</w:t>
+              <w:t>12</w:t>
             </w:r>
           </w:hyperlink>
         </w:p>
@@ -694,7 +734,7 @@
               </w:rPr>
               <w:t>Sound Test</w:t>
               <w:tab/>
-              <w:t>11</w:t>
+              <w:t>12</w:t>
             </w:r>
           </w:hyperlink>
         </w:p>
@@ -714,7 +754,7 @@
               </w:rPr>
               <w:t>Music Test</w:t>
               <w:tab/>
-              <w:t>11</w:t>
+              <w:t>12</w:t>
             </w:r>
           </w:hyperlink>
         </w:p>
@@ -734,7 +774,7 @@
               </w:rPr>
               <w:t>Background Test</w:t>
               <w:tab/>
-              <w:t>11</w:t>
+              <w:t>12</w:t>
             </w:r>
           </w:hyperlink>
         </w:p>
@@ -754,7 +794,7 @@
               </w:rPr>
               <w:t>Sprite Test</w:t>
               <w:tab/>
-              <w:t>11</w:t>
+              <w:t>12</w:t>
             </w:r>
           </w:hyperlink>
         </w:p>
@@ -774,7 +814,7 @@
               </w:rPr>
               <w:t>Reset</w:t>
               <w:tab/>
-              <w:t>11</w:t>
+              <w:t>12</w:t>
             </w:r>
           </w:hyperlink>
         </w:p>
@@ -794,7 +834,7 @@
               </w:rPr>
               <w:t>Chapter 4: Test Architectures</w:t>
               <w:tab/>
-              <w:t>12</w:t>
+              <w:t>13</w:t>
             </w:r>
           </w:hyperlink>
         </w:p>
@@ -807,14 +847,34 @@
             </w:tabs>
             <w:rPr/>
           </w:pPr>
-          <w:hyperlink w:anchor="__RefHeading___Toc915_2335499624" w:tooltip="Abbreviations">
+          <w:hyperlink w:anchor="__RefHeading___Toc915_2335499624" w:tooltip="Appendix A: Abbreviations">
             <w:r>
               <w:rPr>
                 <w:rStyle w:val="IndexLink"/>
               </w:rPr>
-              <w:t>Abbreviations</w:t>
+              <w:t>Appendix A: Abbreviations</w:t>
               <w:tab/>
-              <w:t>13</w:t>
+              <w:t>14</w:t>
+            </w:r>
+          </w:hyperlink>
+        </w:p>
+        <w:p>
+          <w:pPr>
+            <w:pStyle w:val="TOC1"/>
+            <w:tabs>
+              <w:tab w:val="clear" w:pos="9972"/>
+              <w:tab w:val="right" w:pos="9971" w:leader="dot"/>
+            </w:tabs>
+            <w:rPr/>
+          </w:pPr>
+          <w:hyperlink w:anchor="__RefHeading___Toc915_2335499624_Copy_1" w:tooltip="Appendix B: ICs mentioned">
+            <w:r>
+              <w:rPr>
+                <w:rStyle w:val="IndexLink"/>
+              </w:rPr>
+              <w:t>Appendix B: ICs mentioned</w:t>
+              <w:tab/>
+              <w:t>15</w:t>
             </w:r>
           </w:hyperlink>
           <w:r>
@@ -1453,6 +1513,31 @@
     </w:p>
     <w:p>
       <w:pPr>
+        <w:pStyle w:val="BodyText"/>
+        <w:numPr>
+          <w:ilvl w:val="0"/>
+          <w:numId w:val="0"/>
+        </w:numPr>
+        <w:bidi w:val="0"/>
+        <w:ind w:hanging="0" w:start="0"/>
+        <w:jc w:val="start"/>
+        <w:rPr/>
+      </w:pPr>
+      <w:r>
+        <w:rPr/>
+        <w:t xml:space="preserve">There are two RAM tests that tests the ICs themselves. The first test fills all of RAM with a multiple of $11. It increments the RAM each pass by $11 until it does $FF. It works by filling the RAM first and then checking it after. By that time, it has had enough time for the RAM to become flakey in theory and then test each individual bit. If an error is detected, it sets a corresponding bit to the test results register. </w:t>
+      </w:r>
+      <w:r>
+        <w:rPr/>
+        <w:t xml:space="preserve">In the event there is a RAM failure, eleven tones will play. Refere to the “RAM Failure Tones” section to identify which RAM failed. </w:t>
+      </w:r>
+      <w:r>
+        <w:rPr/>
+        <w:t>Also refer to sections following it to see to which RAM IC it corresponds to.</w:t>
+      </w:r>
+    </w:p>
+    <w:p>
+      <w:pPr>
         <w:pStyle w:val="Heading3"/>
         <w:numPr>
           <w:ilvl w:val="2"/>
@@ -1467,9 +1552,750 @@
       <w:bookmarkEnd w:id="8"/>
       <w:r>
         <w:rPr/>
-        <w:t>RAM Bank Test</w:t>
-      </w:r>
-    </w:p>
+        <w:t>RAM Bank Tes</w:t>
+      </w:r>
+      <w:r>
+        <w:rPr/>
+        <w:t>t</w:t>
+      </w:r>
+    </w:p>
+    <w:p>
+      <w:pPr>
+        <w:pStyle w:val="BodyText"/>
+        <w:bidi w:val="0"/>
+        <w:ind w:hanging="0" w:start="0"/>
+        <w:jc w:val="start"/>
+        <w:rPr/>
+      </w:pPr>
+      <w:r>
+        <w:rPr/>
+        <w:t xml:space="preserve">The RAM bank test has to be handled differently. It is possible for all of the RAM tests to pass but still have a failure in addressing. One scenario is only the RAM0 bank is able to be selected. It could still report pass as only one bank is tested at a time. The solution for this is to write a different value to each bank and read it back. If the values are overwritten then there is an addressing/bank issue. The bank test will only process results if all RAM tests are reported as “good”. If there is a RAM failure before, it will print a result of “N.A.” as it would be impossible for it to pass this way. In the event that a bank failure is reported, </w:t>
+      </w:r>
+      <w:r>
+        <w:rPr/>
+        <w:t>the 11</w:t>
+      </w:r>
+      <w:r>
+        <w:rPr>
+          <w:vertAlign w:val="superscript"/>
+        </w:rPr>
+        <w:t>th</w:t>
+      </w:r>
+      <w:r>
+        <w:rPr/>
+        <w:t xml:space="preserve"> tone will be a crash and it will report the failure on the screen.</w:t>
+      </w:r>
+    </w:p>
+    <w:p>
+      <w:pPr>
+        <w:pStyle w:val="Heading3"/>
+        <w:numPr>
+          <w:ilvl w:val="2"/>
+          <w:numId w:val="2"/>
+        </w:numPr>
+        <w:rPr/>
+      </w:pPr>
+      <w:bookmarkStart w:id="9" w:name="__RefHeading___Toc3936_33709793"/>
+      <w:bookmarkEnd w:id="9"/>
+      <w:r>
+        <w:rPr/>
+        <w:t>Brief Explaination of RAM Functionality</w:t>
+      </w:r>
+    </w:p>
+    <w:p>
+      <w:pPr>
+        <w:pStyle w:val="BodyText"/>
+        <w:numPr>
+          <w:ilvl w:val="0"/>
+          <w:numId w:val="0"/>
+        </w:numPr>
+        <w:bidi w:val="0"/>
+        <w:ind w:hanging="0" w:start="0"/>
+        <w:jc w:val="start"/>
+        <w:rPr/>
+      </w:pPr>
+      <w:r>
+        <w:rPr/>
+        <w:t>On TKG4 hardware, the 74LS138 at 2D is what selects the work RAM banks. It also must be selected by the 74LS138 at 4D in order to properly select the bank. In order to also select the RAM, a read or write has to occur, that signal is generated by the CPU which feeds it to through a 74LS367 buffer. The write signal that is consumed by the work RAM is also acquired this way.</w:t>
+      </w:r>
+    </w:p>
+    <w:p>
+      <w:pPr>
+        <w:pStyle w:val="BodyText"/>
+        <w:numPr>
+          <w:ilvl w:val="0"/>
+          <w:numId w:val="0"/>
+        </w:numPr>
+        <w:bidi w:val="0"/>
+        <w:ind w:hanging="0" w:start="0"/>
+        <w:jc w:val="start"/>
+        <w:rPr/>
+      </w:pPr>
+      <w:r>
+        <w:rPr/>
+        <w:t xml:space="preserve">Sprite </w:t>
+      </w:r>
+      <w:r>
+        <w:rPr/>
+        <w:t xml:space="preserve">and video </w:t>
+      </w:r>
+      <w:r>
+        <w:rPr/>
+        <w:t xml:space="preserve">RAM is a bit different. In the schematics </w:t>
+      </w:r>
+      <w:r>
+        <w:rPr/>
+        <w:t>sprite RAM</w:t>
+      </w:r>
+      <w:r>
+        <w:rPr/>
+        <w:t xml:space="preserve"> is labeled “Obj RAM” or “Object RAM”. </w:t>
+      </w:r>
+      <w:r>
+        <w:rPr/>
+        <w:t xml:space="preserve">Video RAM is just labeled as VRAM. The write signals for both of these RAMs are generated by the 74LS138 at 2C. The read signals for these RAMs are generated by the 74LS138 at 2B. Part of the selection is done by the 74LS138 at 4D. The 74LS139 at 2A and 74LS32 at 1A </w:t>
+      </w:r>
+      <w:r>
+        <w:rPr/>
+        <w:t>is involved with the DMA side of the sprite RAM, making the “ObjRq” or “Object Request” signal. TKG hardware is capable of transfering data</w:t>
+      </w:r>
+      <w:r>
+        <w:rPr/>
+        <w:t xml:space="preserve">. </w:t>
+      </w:r>
+      <w:r>
+        <w:rPr/>
+        <w:t>This ObjRq is in part responsible for that.</w:t>
+      </w:r>
+      <w:r>
+        <w:rPr/>
+        <w:t xml:space="preserve"> </w:t>
+      </w:r>
+      <w:r>
+        <w:rPr/>
+        <w:t xml:space="preserve">These are for the most part all of </w:t>
+      </w:r>
+      <w:r>
+        <w:rPr/>
+        <w:t>what is involved with the sprite and video RAM on the CPU side.</w:t>
+      </w:r>
+    </w:p>
+    <w:p>
+      <w:pPr>
+        <w:pStyle w:val="BodyText"/>
+        <w:numPr>
+          <w:ilvl w:val="0"/>
+          <w:numId w:val="0"/>
+        </w:numPr>
+        <w:bidi w:val="0"/>
+        <w:ind w:hanging="0" w:start="0"/>
+        <w:jc w:val="start"/>
+        <w:rPr/>
+      </w:pPr>
+      <w:r>
+        <w:rPr/>
+        <w:t xml:space="preserve">The video PCB side is adds an extra layer of complexity as the sprite and video RAM data has to be utilized by the rest of the video board. It does this by switching between video counter signals and CPU address lines depending on the situation. Whenever the CPU needs to access sprite or video RAM, the appropriate 74LS157s switch the address lines from the video counters to the address lines. After that switch the appropriate 74LS245 buffer turns on and gives access to the </w:t>
+      </w:r>
+      <w:r>
+        <w:rPr/>
+        <w:t>sprite or video</w:t>
+      </w:r>
+      <w:r>
+        <w:rPr/>
+        <w:t xml:space="preserve"> RAM data lines.</w:t>
+      </w:r>
+    </w:p>
+    <w:p>
+      <w:pPr>
+        <w:pStyle w:val="BodyText"/>
+        <w:numPr>
+          <w:ilvl w:val="0"/>
+          <w:numId w:val="0"/>
+        </w:numPr>
+        <w:bidi w:val="0"/>
+        <w:ind w:hanging="0" w:start="0"/>
+        <w:jc w:val="start"/>
+        <w:rPr/>
+      </w:pPr>
+      <w:r>
+        <w:rPr/>
+        <w:t>Unforutnately the test ROM can only validate that the CPU has access to the sprite and video RAM. It cannot directly test how the video board interprets that data. However, the background and sprite test can be used to troubleshoot the video PCB functionality.</w:t>
+      </w:r>
+    </w:p>
+    <w:p>
+      <w:pPr>
+        <w:pStyle w:val="Heading3"/>
+        <w:numPr>
+          <w:ilvl w:val="2"/>
+          <w:numId w:val="2"/>
+        </w:numPr>
+        <w:ind w:hanging="0" w:start="0"/>
+        <w:rPr/>
+      </w:pPr>
+      <w:bookmarkStart w:id="10" w:name="__RefHeading___Toc3938_33709793"/>
+      <w:bookmarkEnd w:id="10"/>
+      <w:r>
+        <w:rPr/>
+        <w:t>RAM Failure Tones</w:t>
+      </w:r>
+    </w:p>
+    <w:p>
+      <w:pPr>
+        <w:pStyle w:val="BodyText"/>
+        <w:numPr>
+          <w:ilvl w:val="0"/>
+          <w:numId w:val="0"/>
+        </w:numPr>
+        <w:bidi w:val="0"/>
+        <w:ind w:hanging="0" w:start="0"/>
+        <w:jc w:val="start"/>
+        <w:rPr/>
+      </w:pPr>
+      <w:r>
+        <w:rPr/>
+        <w:t xml:space="preserve">In the event there is a RAM error, it will play eleven tones: </w:t>
+      </w:r>
+      <w:r>
+        <w:rPr/>
+        <w:t>jump sound indicates a pass, crash indicates a failure. This is reliant on the discretely generated sounds jump and crash being functional. If they are not working it may not sound correct.</w:t>
+      </w:r>
+    </w:p>
+    <w:tbl>
+      <w:tblPr>
+        <w:tblW w:w="3960" w:type="dxa"/>
+        <w:jc w:val="start"/>
+        <w:tblInd w:w="-22" w:type="dxa"/>
+        <w:tblLayout w:type="fixed"/>
+        <w:tblCellMar>
+          <w:top w:w="29" w:type="dxa"/>
+          <w:start w:w="29" w:type="dxa"/>
+          <w:bottom w:w="29" w:type="dxa"/>
+          <w:end w:w="29" w:type="dxa"/>
+        </w:tblCellMar>
+      </w:tblPr>
+      <w:tblGrid>
+        <w:gridCol w:w="1530"/>
+        <w:gridCol w:w="2430"/>
+      </w:tblGrid>
+      <w:tr>
+        <w:trPr/>
+        <w:tc>
+          <w:tcPr>
+            <w:tcW w:w="1530" w:type="dxa"/>
+            <w:tcBorders>
+              <w:top w:val="single" w:sz="18" w:space="0" w:color="000000"/>
+              <w:start w:val="single" w:sz="18" w:space="0" w:color="000000"/>
+              <w:bottom w:val="single" w:sz="2" w:space="0" w:color="000000"/>
+            </w:tcBorders>
+          </w:tcPr>
+          <w:p>
+            <w:pPr>
+              <w:pStyle w:val="TableContents"/>
+              <w:rPr>
+                <w:b/>
+                <w:bCs/>
+              </w:rPr>
+            </w:pPr>
+            <w:r>
+              <w:rPr>
+                <w:b/>
+                <w:bCs/>
+              </w:rPr>
+              <w:t>Tone #</w:t>
+            </w:r>
+          </w:p>
+        </w:tc>
+        <w:tc>
+          <w:tcPr>
+            <w:tcW w:w="2430" w:type="dxa"/>
+            <w:tcBorders>
+              <w:top w:val="single" w:sz="18" w:space="0" w:color="000000"/>
+              <w:start w:val="single" w:sz="6" w:space="0" w:color="000000"/>
+              <w:bottom w:val="single" w:sz="2" w:space="0" w:color="000000"/>
+              <w:end w:val="single" w:sz="18" w:space="0" w:color="000000"/>
+            </w:tcBorders>
+          </w:tcPr>
+          <w:p>
+            <w:pPr>
+              <w:pStyle w:val="TableContents"/>
+              <w:rPr>
+                <w:b/>
+                <w:bCs/>
+              </w:rPr>
+            </w:pPr>
+            <w:r>
+              <w:rPr>
+                <w:b/>
+                <w:bCs/>
+              </w:rPr>
+              <w:t>RAM Test</w:t>
+            </w:r>
+          </w:p>
+        </w:tc>
+      </w:tr>
+      <w:tr>
+        <w:trPr/>
+        <w:tc>
+          <w:tcPr>
+            <w:tcW w:w="1530" w:type="dxa"/>
+            <w:tcBorders>
+              <w:start w:val="single" w:sz="18" w:space="0" w:color="000000"/>
+              <w:bottom w:val="single" w:sz="2" w:space="0" w:color="000000"/>
+            </w:tcBorders>
+          </w:tcPr>
+          <w:p>
+            <w:pPr>
+              <w:pStyle w:val="TableContents"/>
+              <w:rPr/>
+            </w:pPr>
+            <w:r>
+              <w:rPr/>
+              <w:t>1</w:t>
+            </w:r>
+          </w:p>
+        </w:tc>
+        <w:tc>
+          <w:tcPr>
+            <w:tcW w:w="2430" w:type="dxa"/>
+            <w:tcBorders>
+              <w:start w:val="single" w:sz="6" w:space="0" w:color="000000"/>
+              <w:bottom w:val="single" w:sz="2" w:space="0" w:color="000000"/>
+              <w:end w:val="single" w:sz="18" w:space="0" w:color="000000"/>
+            </w:tcBorders>
+          </w:tcPr>
+          <w:p>
+            <w:pPr>
+              <w:pStyle w:val="TableContents"/>
+              <w:rPr/>
+            </w:pPr>
+            <w:r>
+              <w:rPr/>
+              <w:t>RAM0 Low</w:t>
+            </w:r>
+          </w:p>
+        </w:tc>
+      </w:tr>
+      <w:tr>
+        <w:trPr/>
+        <w:tc>
+          <w:tcPr>
+            <w:tcW w:w="1530" w:type="dxa"/>
+            <w:tcBorders>
+              <w:start w:val="single" w:sz="18" w:space="0" w:color="000000"/>
+              <w:bottom w:val="single" w:sz="2" w:space="0" w:color="000000"/>
+            </w:tcBorders>
+          </w:tcPr>
+          <w:p>
+            <w:pPr>
+              <w:pStyle w:val="TableContents"/>
+              <w:rPr/>
+            </w:pPr>
+            <w:r>
+              <w:rPr/>
+              <w:t>2</w:t>
+            </w:r>
+          </w:p>
+        </w:tc>
+        <w:tc>
+          <w:tcPr>
+            <w:tcW w:w="2430" w:type="dxa"/>
+            <w:tcBorders>
+              <w:start w:val="single" w:sz="6" w:space="0" w:color="000000"/>
+              <w:bottom w:val="single" w:sz="2" w:space="0" w:color="000000"/>
+              <w:end w:val="single" w:sz="18" w:space="0" w:color="000000"/>
+            </w:tcBorders>
+          </w:tcPr>
+          <w:p>
+            <w:pPr>
+              <w:pStyle w:val="TableContents"/>
+              <w:rPr/>
+            </w:pPr>
+            <w:r>
+              <w:rPr/>
+              <w:t>RAM0 High</w:t>
+            </w:r>
+          </w:p>
+        </w:tc>
+      </w:tr>
+      <w:tr>
+        <w:trPr/>
+        <w:tc>
+          <w:tcPr>
+            <w:tcW w:w="1530" w:type="dxa"/>
+            <w:tcBorders>
+              <w:start w:val="single" w:sz="18" w:space="0" w:color="000000"/>
+              <w:bottom w:val="single" w:sz="2" w:space="0" w:color="000000"/>
+            </w:tcBorders>
+          </w:tcPr>
+          <w:p>
+            <w:pPr>
+              <w:pStyle w:val="TableContents"/>
+              <w:rPr/>
+            </w:pPr>
+            <w:r>
+              <w:rPr/>
+              <w:t>3</w:t>
+            </w:r>
+          </w:p>
+        </w:tc>
+        <w:tc>
+          <w:tcPr>
+            <w:tcW w:w="2430" w:type="dxa"/>
+            <w:tcBorders>
+              <w:start w:val="single" w:sz="6" w:space="0" w:color="000000"/>
+              <w:bottom w:val="single" w:sz="2" w:space="0" w:color="000000"/>
+              <w:end w:val="single" w:sz="18" w:space="0" w:color="000000"/>
+            </w:tcBorders>
+          </w:tcPr>
+          <w:p>
+            <w:pPr>
+              <w:pStyle w:val="TableContents"/>
+              <w:rPr/>
+            </w:pPr>
+            <w:r>
+              <w:rPr/>
+              <w:t>RAM1 Low</w:t>
+            </w:r>
+          </w:p>
+        </w:tc>
+      </w:tr>
+      <w:tr>
+        <w:trPr/>
+        <w:tc>
+          <w:tcPr>
+            <w:tcW w:w="1530" w:type="dxa"/>
+            <w:tcBorders>
+              <w:start w:val="single" w:sz="18" w:space="0" w:color="000000"/>
+              <w:bottom w:val="single" w:sz="2" w:space="0" w:color="000000"/>
+            </w:tcBorders>
+          </w:tcPr>
+          <w:p>
+            <w:pPr>
+              <w:pStyle w:val="TableContents"/>
+              <w:rPr/>
+            </w:pPr>
+            <w:r>
+              <w:rPr/>
+              <w:t>4</w:t>
+            </w:r>
+          </w:p>
+        </w:tc>
+        <w:tc>
+          <w:tcPr>
+            <w:tcW w:w="2430" w:type="dxa"/>
+            <w:tcBorders>
+              <w:start w:val="single" w:sz="6" w:space="0" w:color="000000"/>
+              <w:bottom w:val="single" w:sz="2" w:space="0" w:color="000000"/>
+              <w:end w:val="single" w:sz="18" w:space="0" w:color="000000"/>
+            </w:tcBorders>
+          </w:tcPr>
+          <w:p>
+            <w:pPr>
+              <w:pStyle w:val="TableContents"/>
+              <w:rPr/>
+            </w:pPr>
+            <w:r>
+              <w:rPr/>
+              <w:t>RAM1 High</w:t>
+            </w:r>
+          </w:p>
+        </w:tc>
+      </w:tr>
+      <w:tr>
+        <w:trPr/>
+        <w:tc>
+          <w:tcPr>
+            <w:tcW w:w="1530" w:type="dxa"/>
+            <w:tcBorders>
+              <w:start w:val="single" w:sz="18" w:space="0" w:color="000000"/>
+              <w:bottom w:val="single" w:sz="2" w:space="0" w:color="000000"/>
+            </w:tcBorders>
+          </w:tcPr>
+          <w:p>
+            <w:pPr>
+              <w:pStyle w:val="TableContents"/>
+              <w:rPr/>
+            </w:pPr>
+            <w:r>
+              <w:rPr/>
+              <w:t>5</w:t>
+            </w:r>
+          </w:p>
+        </w:tc>
+        <w:tc>
+          <w:tcPr>
+            <w:tcW w:w="2430" w:type="dxa"/>
+            <w:tcBorders>
+              <w:start w:val="single" w:sz="6" w:space="0" w:color="000000"/>
+              <w:bottom w:val="single" w:sz="2" w:space="0" w:color="000000"/>
+              <w:end w:val="single" w:sz="18" w:space="0" w:color="000000"/>
+            </w:tcBorders>
+          </w:tcPr>
+          <w:p>
+            <w:pPr>
+              <w:pStyle w:val="TableContents"/>
+              <w:rPr/>
+            </w:pPr>
+            <w:r>
+              <w:rPr/>
+              <w:t>RAM2 Low</w:t>
+            </w:r>
+          </w:p>
+        </w:tc>
+      </w:tr>
+      <w:tr>
+        <w:trPr/>
+        <w:tc>
+          <w:tcPr>
+            <w:tcW w:w="1530" w:type="dxa"/>
+            <w:tcBorders>
+              <w:start w:val="single" w:sz="18" w:space="0" w:color="000000"/>
+              <w:bottom w:val="single" w:sz="2" w:space="0" w:color="000000"/>
+            </w:tcBorders>
+          </w:tcPr>
+          <w:p>
+            <w:pPr>
+              <w:pStyle w:val="TableContents"/>
+              <w:rPr/>
+            </w:pPr>
+            <w:r>
+              <w:rPr/>
+              <w:t>6</w:t>
+            </w:r>
+          </w:p>
+        </w:tc>
+        <w:tc>
+          <w:tcPr>
+            <w:tcW w:w="2430" w:type="dxa"/>
+            <w:tcBorders>
+              <w:start w:val="single" w:sz="6" w:space="0" w:color="000000"/>
+              <w:bottom w:val="single" w:sz="2" w:space="0" w:color="000000"/>
+              <w:end w:val="single" w:sz="18" w:space="0" w:color="000000"/>
+            </w:tcBorders>
+          </w:tcPr>
+          <w:p>
+            <w:pPr>
+              <w:pStyle w:val="TableContents"/>
+              <w:rPr/>
+            </w:pPr>
+            <w:r>
+              <w:rPr/>
+              <w:t>RAM2 High</w:t>
+            </w:r>
+          </w:p>
+        </w:tc>
+      </w:tr>
+      <w:tr>
+        <w:trPr/>
+        <w:tc>
+          <w:tcPr>
+            <w:tcW w:w="1530" w:type="dxa"/>
+            <w:tcBorders>
+              <w:start w:val="single" w:sz="18" w:space="0" w:color="000000"/>
+              <w:bottom w:val="single" w:sz="2" w:space="0" w:color="000000"/>
+            </w:tcBorders>
+          </w:tcPr>
+          <w:p>
+            <w:pPr>
+              <w:pStyle w:val="TableContents"/>
+              <w:rPr/>
+            </w:pPr>
+            <w:r>
+              <w:rPr/>
+              <w:t>7</w:t>
+            </w:r>
+          </w:p>
+        </w:tc>
+        <w:tc>
+          <w:tcPr>
+            <w:tcW w:w="2430" w:type="dxa"/>
+            <w:tcBorders>
+              <w:start w:val="single" w:sz="6" w:space="0" w:color="000000"/>
+              <w:bottom w:val="single" w:sz="2" w:space="0" w:color="000000"/>
+              <w:end w:val="single" w:sz="18" w:space="0" w:color="000000"/>
+            </w:tcBorders>
+          </w:tcPr>
+          <w:p>
+            <w:pPr>
+              <w:pStyle w:val="TableContents"/>
+              <w:rPr/>
+            </w:pPr>
+            <w:r>
+              <w:rPr/>
+              <w:t>RAM3 (Sprite) Low</w:t>
+            </w:r>
+          </w:p>
+        </w:tc>
+      </w:tr>
+      <w:tr>
+        <w:trPr/>
+        <w:tc>
+          <w:tcPr>
+            <w:tcW w:w="1530" w:type="dxa"/>
+            <w:tcBorders>
+              <w:start w:val="single" w:sz="18" w:space="0" w:color="000000"/>
+              <w:bottom w:val="single" w:sz="2" w:space="0" w:color="000000"/>
+            </w:tcBorders>
+          </w:tcPr>
+          <w:p>
+            <w:pPr>
+              <w:pStyle w:val="TableContents"/>
+              <w:rPr/>
+            </w:pPr>
+            <w:r>
+              <w:rPr/>
+              <w:t>8</w:t>
+            </w:r>
+          </w:p>
+        </w:tc>
+        <w:tc>
+          <w:tcPr>
+            <w:tcW w:w="2430" w:type="dxa"/>
+            <w:tcBorders>
+              <w:start w:val="single" w:sz="6" w:space="0" w:color="000000"/>
+              <w:bottom w:val="single" w:sz="2" w:space="0" w:color="000000"/>
+              <w:end w:val="single" w:sz="18" w:space="0" w:color="000000"/>
+            </w:tcBorders>
+          </w:tcPr>
+          <w:p>
+            <w:pPr>
+              <w:pStyle w:val="TableContents"/>
+              <w:rPr/>
+            </w:pPr>
+            <w:r>
+              <w:rPr/>
+              <w:t>RAM3 (Sprite) High</w:t>
+            </w:r>
+          </w:p>
+        </w:tc>
+      </w:tr>
+      <w:tr>
+        <w:trPr/>
+        <w:tc>
+          <w:tcPr>
+            <w:tcW w:w="1530" w:type="dxa"/>
+            <w:tcBorders>
+              <w:start w:val="single" w:sz="18" w:space="0" w:color="000000"/>
+              <w:bottom w:val="single" w:sz="2" w:space="0" w:color="000000"/>
+            </w:tcBorders>
+          </w:tcPr>
+          <w:p>
+            <w:pPr>
+              <w:pStyle w:val="TableContents"/>
+              <w:rPr/>
+            </w:pPr>
+            <w:r>
+              <w:rPr/>
+              <w:t>9</w:t>
+            </w:r>
+          </w:p>
+        </w:tc>
+        <w:tc>
+          <w:tcPr>
+            <w:tcW w:w="2430" w:type="dxa"/>
+            <w:tcBorders>
+              <w:start w:val="single" w:sz="6" w:space="0" w:color="000000"/>
+              <w:bottom w:val="single" w:sz="2" w:space="0" w:color="000000"/>
+              <w:end w:val="single" w:sz="18" w:space="0" w:color="000000"/>
+            </w:tcBorders>
+          </w:tcPr>
+          <w:p>
+            <w:pPr>
+              <w:pStyle w:val="TableContents"/>
+              <w:rPr/>
+            </w:pPr>
+            <w:r>
+              <w:rPr/>
+              <w:t>RAM4 (Video) Low</w:t>
+            </w:r>
+          </w:p>
+        </w:tc>
+      </w:tr>
+      <w:tr>
+        <w:trPr/>
+        <w:tc>
+          <w:tcPr>
+            <w:tcW w:w="1530" w:type="dxa"/>
+            <w:tcBorders>
+              <w:start w:val="single" w:sz="18" w:space="0" w:color="000000"/>
+              <w:bottom w:val="single" w:sz="2" w:space="0" w:color="000000"/>
+            </w:tcBorders>
+          </w:tcPr>
+          <w:p>
+            <w:pPr>
+              <w:pStyle w:val="TableContents"/>
+              <w:rPr/>
+            </w:pPr>
+            <w:r>
+              <w:rPr/>
+              <w:t>10</w:t>
+            </w:r>
+          </w:p>
+        </w:tc>
+        <w:tc>
+          <w:tcPr>
+            <w:tcW w:w="2430" w:type="dxa"/>
+            <w:tcBorders>
+              <w:start w:val="single" w:sz="6" w:space="0" w:color="000000"/>
+              <w:bottom w:val="single" w:sz="2" w:space="0" w:color="000000"/>
+              <w:end w:val="single" w:sz="18" w:space="0" w:color="000000"/>
+            </w:tcBorders>
+          </w:tcPr>
+          <w:p>
+            <w:pPr>
+              <w:pStyle w:val="TableContents"/>
+              <w:rPr/>
+            </w:pPr>
+            <w:r>
+              <w:rPr/>
+              <w:t>RAM4 (Video) High</w:t>
+            </w:r>
+          </w:p>
+        </w:tc>
+      </w:tr>
+      <w:tr>
+        <w:trPr/>
+        <w:tc>
+          <w:tcPr>
+            <w:tcW w:w="1530" w:type="dxa"/>
+            <w:tcBorders>
+              <w:start w:val="single" w:sz="18" w:space="0" w:color="000000"/>
+              <w:bottom w:val="single" w:sz="18" w:space="0" w:color="000000"/>
+            </w:tcBorders>
+          </w:tcPr>
+          <w:p>
+            <w:pPr>
+              <w:pStyle w:val="TableContents"/>
+              <w:rPr/>
+            </w:pPr>
+            <w:r>
+              <w:rPr/>
+              <w:t>11</w:t>
+            </w:r>
+          </w:p>
+        </w:tc>
+        <w:tc>
+          <w:tcPr>
+            <w:tcW w:w="2430" w:type="dxa"/>
+            <w:tcBorders>
+              <w:start w:val="single" w:sz="6" w:space="0" w:color="000000"/>
+              <w:bottom w:val="single" w:sz="18" w:space="0" w:color="000000"/>
+              <w:end w:val="single" w:sz="18" w:space="0" w:color="000000"/>
+            </w:tcBorders>
+          </w:tcPr>
+          <w:p>
+            <w:pPr>
+              <w:pStyle w:val="TableContents"/>
+              <w:rPr/>
+            </w:pPr>
+            <w:r>
+              <w:rPr/>
+              <w:t>RAM Bank Test</w:t>
+            </w:r>
+          </w:p>
+        </w:tc>
+      </w:tr>
+    </w:tbl>
     <w:p>
       <w:pPr>
         <w:pStyle w:val="Heading3"/>
@@ -1482,8 +2308,8 @@
         <w:jc w:val="start"/>
         <w:rPr/>
       </w:pPr>
-      <w:bookmarkStart w:id="9" w:name="__RefHeading___Toc812_1351480008"/>
-      <w:bookmarkEnd w:id="9"/>
+      <w:bookmarkStart w:id="11" w:name="__RefHeading___Toc812_1351480008"/>
+      <w:bookmarkEnd w:id="11"/>
       <w:r>
         <w:rPr/>
         <w:t>TRS2 and TKG2 RAM Locations</w:t>
@@ -2561,8 +3387,8 @@
         <w:jc w:val="start"/>
         <w:rPr/>
       </w:pPr>
-      <w:bookmarkStart w:id="10" w:name="__RefHeading___Toc814_1351480008"/>
-      <w:bookmarkEnd w:id="10"/>
+      <w:bookmarkStart w:id="12" w:name="__RefHeading___Toc814_1351480008"/>
+      <w:bookmarkEnd w:id="12"/>
       <w:r>
         <w:rPr/>
         <w:t>TKG3 RAM Locations</w:t>
@@ -3645,8 +4471,8 @@
         <w:jc w:val="start"/>
         <w:rPr/>
       </w:pPr>
-      <w:bookmarkStart w:id="11" w:name="__RefHeading___Toc816_1351480008"/>
-      <w:bookmarkEnd w:id="11"/>
+      <w:bookmarkStart w:id="13" w:name="__RefHeading___Toc816_1351480008"/>
+      <w:bookmarkEnd w:id="13"/>
       <w:r>
         <w:rPr/>
         <w:t>TKG4 RAM Locations</w:t>
@@ -4703,29 +5529,18 @@
     </w:tbl>
     <w:p>
       <w:pPr>
-        <w:pStyle w:val="BodyText"/>
-        <w:bidi w:val="0"/>
-        <w:jc w:val="start"/>
-        <w:rPr/>
-      </w:pPr>
-      <w:r>
-        <w:rPr/>
-      </w:r>
-    </w:p>
-    <w:p>
-      <w:pPr>
         <w:pStyle w:val="Heading2"/>
         <w:numPr>
-          <w:ilvl w:val="1"/>
-          <w:numId w:val="2"/>
+          <w:ilvl w:val="0"/>
+          <w:numId w:val="0"/>
         </w:numPr>
         <w:bidi w:val="0"/>
         <w:ind w:hanging="0" w:start="0"/>
         <w:jc w:val="start"/>
         <w:rPr/>
       </w:pPr>
-      <w:bookmarkStart w:id="12" w:name="__RefHeading___Toc219_1351480008"/>
-      <w:bookmarkEnd w:id="12"/>
+      <w:bookmarkStart w:id="14" w:name="__RefHeading___Toc219_1351480008"/>
+      <w:bookmarkEnd w:id="14"/>
       <w:r>
         <w:rPr/>
         <w:t>ROM Checksums</w:t>
@@ -4755,8 +5570,8 @@
         <w:jc w:val="start"/>
         <w:rPr/>
       </w:pPr>
-      <w:bookmarkStart w:id="13" w:name="__RefHeading___Toc820_1351480008"/>
-      <w:bookmarkEnd w:id="13"/>
+      <w:bookmarkStart w:id="15" w:name="__RefHeading___Toc820_1351480008"/>
+      <w:bookmarkEnd w:id="15"/>
       <w:r>
         <w:rPr/>
         <w:t>Test ROM Integrity Test</w:t>
@@ -4771,35 +5586,21 @@
       </w:pPr>
       <w:r>
         <w:rPr/>
-        <w:t>As part of the ROM test, ROM 0 will be validated. ROM 0 is the test ROM itself. Its own checksum is appended to the footer as part of a post-build script. It will compare the measured checksum with what is expected. If there is any corruption of the test ROM or if there is issues with accessing say the upper addresses, it will report a failure by printing “Integrity Fail”. In this case, the test ROM may not be trustworthy and could run into issues during execution.</w:t>
-      </w:r>
-    </w:p>
-    <w:p>
-      <w:pPr>
-        <w:pStyle w:val="Heading3"/>
-        <w:numPr>
-          <w:ilvl w:val="2"/>
-          <w:numId w:val="2"/>
-        </w:numPr>
-        <w:bidi w:val="0"/>
-        <w:ind w:hanging="0" w:start="0"/>
-        <w:jc w:val="start"/>
-        <w:rPr/>
-      </w:pPr>
-      <w:r>
-        <w:rPr/>
+        <w:t xml:space="preserve">As part of the ROM test, ROM 0 will be validated. ROM 0 is the test ROM itself. Its own checksum is appended to the footer as part of a post-build script. It will compare the measured checksum with what is expected. If there is any corruption of the test ROM or if there is issues with accessing say the upper addresses, it will report a failure by printing “Integrity Fail”. In this case, the test ROM may not be </w:t>
+      </w:r>
+      <w:r>
         <w:drawing>
           <wp:anchor distT="0" distB="0" distL="0" distR="0" simplePos="0" relativeHeight="2" behindDoc="0" locked="0" layoutInCell="0" allowOverlap="1">
             <wp:simplePos x="0" y="0"/>
             <wp:positionH relativeFrom="column">
-              <wp:align>center</wp:align>
+              <wp:posOffset>33020</wp:posOffset>
             </wp:positionH>
             <wp:positionV relativeFrom="paragraph">
-              <wp:posOffset>635</wp:posOffset>
+              <wp:posOffset>1075690</wp:posOffset>
             </wp:positionV>
-            <wp:extent cx="6332220" cy="1929130"/>
+            <wp:extent cx="5248275" cy="1598930"/>
             <wp:effectExtent l="0" t="0" r="0" b="0"/>
-            <wp:wrapSquare wrapText="largest"/>
+            <wp:wrapTopAndBottom/>
             <wp:docPr id="4" name="Image1"/>
             <wp:cNvGraphicFramePr>
               <a:graphicFrameLocks xmlns:a="http://schemas.openxmlformats.org/drawingml/2006/main" noChangeAspect="1"/>
@@ -4822,7 +5623,7 @@
                   <pic:spPr bwMode="auto">
                     <a:xfrm>
                       <a:off x="0" y="0"/>
-                      <a:ext cx="6332220" cy="1929130"/>
+                      <a:ext cx="5248275" cy="1598930"/>
                     </a:xfrm>
                     <a:prstGeom prst="rect">
                       <a:avLst/>
@@ -4835,6 +5636,26 @@
           </wp:anchor>
         </w:drawing>
       </w:r>
+      <w:r>
+        <w:rPr/>
+        <w:t>trustworthy and could run into issues during execution.</w:t>
+      </w:r>
+    </w:p>
+    <w:p>
+      <w:pPr>
+        <w:pStyle w:val="Heading3"/>
+        <w:numPr>
+          <w:ilvl w:val="2"/>
+          <w:numId w:val="2"/>
+        </w:numPr>
+        <w:bidi w:val="0"/>
+        <w:ind w:hanging="0" w:start="0"/>
+        <w:jc w:val="start"/>
+        <w:rPr/>
+      </w:pPr>
+      <w:r>
+        <w:rPr/>
+      </w:r>
     </w:p>
     <w:p>
       <w:pPr>
@@ -4846,8 +5667,22 @@
         <w:ind w:hanging="0" w:start="0"/>
         <w:rPr/>
       </w:pPr>
-      <w:bookmarkStart w:id="14" w:name="__RefHeading___Toc1548_1351480008"/>
-      <w:bookmarkEnd w:id="14"/>
+      <w:r>
+        <w:rPr/>
+      </w:r>
+    </w:p>
+    <w:p>
+      <w:pPr>
+        <w:pStyle w:val="Heading3"/>
+        <w:numPr>
+          <w:ilvl w:val="2"/>
+          <w:numId w:val="2"/>
+        </w:numPr>
+        <w:ind w:hanging="0" w:start="0"/>
+        <w:rPr/>
+      </w:pPr>
+      <w:bookmarkStart w:id="16" w:name="__RefHeading___Toc1548_1351480008"/>
+      <w:bookmarkEnd w:id="16"/>
       <w:r>
         <w:rPr/>
         <w:t>ROM Locations</w:t>
@@ -5554,8 +6389,8 @@
         <w:jc w:val="start"/>
         <w:rPr/>
       </w:pPr>
-      <w:bookmarkStart w:id="15" w:name="__RefHeading___Toc822_1351480008"/>
-      <w:bookmarkEnd w:id="15"/>
+      <w:bookmarkStart w:id="17" w:name="__RefHeading___Toc822_1351480008"/>
+      <w:bookmarkEnd w:id="17"/>
       <w:r>
         <w:rPr/>
         <w:t>ROM Checksum Table</w:t>
@@ -6409,8 +7244,8 @@
         <w:jc w:val="start"/>
         <w:rPr/>
       </w:pPr>
-      <w:bookmarkStart w:id="16" w:name="__RefHeading___Toc221_1351480008"/>
-      <w:bookmarkEnd w:id="16"/>
+      <w:bookmarkStart w:id="18" w:name="__RefHeading___Toc221_1351480008"/>
+      <w:bookmarkEnd w:id="18"/>
       <w:r>
         <w:rPr/>
         <w:t>DMA Test</w:t>
@@ -6467,8 +7302,8 @@
         <w:jc w:val="start"/>
         <w:rPr/>
       </w:pPr>
-      <w:bookmarkStart w:id="17" w:name="__RefHeading___Toc223_1351480008"/>
-      <w:bookmarkEnd w:id="17"/>
+      <w:bookmarkStart w:id="19" w:name="__RefHeading___Toc223_1351480008"/>
+      <w:bookmarkEnd w:id="19"/>
       <w:r>
         <w:rPr/>
         <w:t>NMI Test</w:t>
@@ -6524,8 +7359,8 @@
         <w:jc w:val="start"/>
         <w:rPr/>
       </w:pPr>
-      <w:bookmarkStart w:id="18" w:name="__RefHeading___Toc225_1351480008"/>
-      <w:bookmarkEnd w:id="18"/>
+      <w:bookmarkStart w:id="20" w:name="__RefHeading___Toc225_1351480008"/>
+      <w:bookmarkEnd w:id="20"/>
       <w:r>
         <w:rPr/>
         <w:t>Audio Tests</w:t>
@@ -6614,8 +7449,8 @@
         <w:jc w:val="start"/>
         <w:rPr/>
       </w:pPr>
-      <w:bookmarkStart w:id="19" w:name="__RefHeading___Toc824_1351480008"/>
-      <w:bookmarkEnd w:id="19"/>
+      <w:bookmarkStart w:id="21" w:name="__RefHeading___Toc824_1351480008"/>
+      <w:bookmarkEnd w:id="21"/>
       <w:r>
         <w:rPr/>
         <w:t>Transition to Runtime</w:t>
@@ -6655,8 +7490,8 @@
         <w:jc w:val="start"/>
         <w:rPr/>
       </w:pPr>
-      <w:bookmarkStart w:id="20" w:name="__RefHeading___Toc231_1351480008"/>
-      <w:bookmarkEnd w:id="20"/>
+      <w:bookmarkStart w:id="22" w:name="__RefHeading___Toc231_1351480008"/>
+      <w:bookmarkEnd w:id="22"/>
       <w:r>
         <w:rPr/>
         <w:t>Chapter 3: Runtime Tests</w:t>
@@ -6674,8 +7509,8 @@
         <w:jc w:val="start"/>
         <w:rPr/>
       </w:pPr>
-      <w:bookmarkStart w:id="21" w:name="__RefHeading___Toc826_1351480008"/>
-      <w:bookmarkEnd w:id="21"/>
+      <w:bookmarkStart w:id="23" w:name="__RefHeading___Toc826_1351480008"/>
+      <w:bookmarkEnd w:id="23"/>
       <w:r>
         <w:rPr/>
         <w:t>Controls Test</w:t>
@@ -6772,8 +7607,8 @@
         <w:jc w:val="start"/>
         <w:rPr/>
       </w:pPr>
-      <w:bookmarkStart w:id="22" w:name="__RefHeading___Toc828_1351480008"/>
-      <w:bookmarkEnd w:id="22"/>
+      <w:bookmarkStart w:id="24" w:name="__RefHeading___Toc828_1351480008"/>
+      <w:bookmarkEnd w:id="24"/>
       <w:r>
         <w:rPr/>
         <w:t>DIP Switch Test</w:t>
@@ -6912,8 +7747,8 @@
         <w:jc w:val="start"/>
         <w:rPr/>
       </w:pPr>
-      <w:bookmarkStart w:id="23" w:name="__RefHeading___Toc830_1351480008"/>
-      <w:bookmarkEnd w:id="23"/>
+      <w:bookmarkStart w:id="25" w:name="__RefHeading___Toc830_1351480008"/>
+      <w:bookmarkEnd w:id="25"/>
       <w:r>
         <w:rPr/>
         <w:t>Palette Test</w:t>
@@ -6944,8 +7779,8 @@
         <w:jc w:val="start"/>
         <w:rPr/>
       </w:pPr>
-      <w:bookmarkStart w:id="24" w:name="__RefHeading___Toc832_1351480008"/>
-      <w:bookmarkEnd w:id="24"/>
+      <w:bookmarkStart w:id="26" w:name="__RefHeading___Toc832_1351480008"/>
+      <w:bookmarkEnd w:id="26"/>
       <w:r>
         <w:rPr/>
         <w:t>Screen Invert</w:t>
@@ -7270,8 +8105,8 @@
         <w:jc w:val="start"/>
         <w:rPr/>
       </w:pPr>
-      <w:bookmarkStart w:id="25" w:name="__RefHeading___Toc834_1351480008"/>
-      <w:bookmarkEnd w:id="25"/>
+      <w:bookmarkStart w:id="27" w:name="__RefHeading___Toc834_1351480008"/>
+      <w:bookmarkEnd w:id="27"/>
       <w:r>
         <w:rPr/>
         <w:t>Monitor Test</w:t>
@@ -7289,8 +8124,8 @@
         <w:jc w:val="start"/>
         <w:rPr/>
       </w:pPr>
-      <w:bookmarkStart w:id="26" w:name="__RefHeading___Toc836_1351480008"/>
-      <w:bookmarkEnd w:id="26"/>
+      <w:bookmarkStart w:id="28" w:name="__RefHeading___Toc836_1351480008"/>
+      <w:bookmarkEnd w:id="28"/>
       <w:r>
         <w:rPr/>
         <w:t>Sound Test</w:t>
@@ -7308,8 +8143,8 @@
         <w:jc w:val="start"/>
         <w:rPr/>
       </w:pPr>
-      <w:bookmarkStart w:id="27" w:name="__RefHeading___Toc838_1351480008"/>
-      <w:bookmarkEnd w:id="27"/>
+      <w:bookmarkStart w:id="29" w:name="__RefHeading___Toc838_1351480008"/>
+      <w:bookmarkEnd w:id="29"/>
       <w:r>
         <w:rPr/>
         <w:t>Music Test</w:t>
@@ -7327,8 +8162,8 @@
         <w:jc w:val="start"/>
         <w:rPr/>
       </w:pPr>
-      <w:bookmarkStart w:id="28" w:name="__RefHeading___Toc840_1351480008"/>
-      <w:bookmarkEnd w:id="28"/>
+      <w:bookmarkStart w:id="30" w:name="__RefHeading___Toc840_1351480008"/>
+      <w:bookmarkEnd w:id="30"/>
       <w:r>
         <w:rPr/>
         <w:t>Background Test</w:t>
@@ -7346,8 +8181,8 @@
         <w:jc w:val="start"/>
         <w:rPr/>
       </w:pPr>
-      <w:bookmarkStart w:id="29" w:name="__RefHeading___Toc842_1351480008"/>
-      <w:bookmarkEnd w:id="29"/>
+      <w:bookmarkStart w:id="31" w:name="__RefHeading___Toc842_1351480008"/>
+      <w:bookmarkEnd w:id="31"/>
       <w:r>
         <w:rPr/>
         <w:t>Sprite Test</w:t>
@@ -7365,8 +8200,8 @@
         <w:jc w:val="start"/>
         <w:rPr/>
       </w:pPr>
-      <w:bookmarkStart w:id="30" w:name="__RefHeading___Toc844_1351480008"/>
-      <w:bookmarkEnd w:id="30"/>
+      <w:bookmarkStart w:id="32" w:name="__RefHeading___Toc844_1351480008"/>
+      <w:bookmarkEnd w:id="32"/>
       <w:r>
         <w:rPr/>
         <w:t>Reset</w:t>
@@ -7423,8 +8258,8 @@
         <w:jc w:val="start"/>
         <w:rPr/>
       </w:pPr>
-      <w:bookmarkStart w:id="31" w:name="__RefHeading___Toc233_1351480008"/>
-      <w:bookmarkEnd w:id="31"/>
+      <w:bookmarkStart w:id="33" w:name="__RefHeading___Toc233_1351480008"/>
+      <w:bookmarkEnd w:id="33"/>
       <w:r>
         <w:rPr/>
         <w:t>Chapter 4: Test Architectures</w:t>
@@ -7461,8 +8296,12 @@
         <w:ind w:hanging="0" w:start="0"/>
         <w:rPr/>
       </w:pPr>
-      <w:bookmarkStart w:id="32" w:name="__RefHeading___Toc915_2335499624"/>
-      <w:bookmarkEnd w:id="32"/>
+      <w:bookmarkStart w:id="34" w:name="__RefHeading___Toc915_2335499624"/>
+      <w:bookmarkEnd w:id="34"/>
+      <w:r>
+        <w:rPr/>
+        <w:t xml:space="preserve">Appendix A: </w:t>
+      </w:r>
       <w:r>
         <w:rPr/>
         <w:t>Abbreviations</w:t>
@@ -7676,10 +8515,281 @@
         <w:t xml:space="preserve"> Read Only Memory</w:t>
       </w:r>
     </w:p>
+    <w:p>
+      <w:pPr>
+        <w:pStyle w:val="BodyText"/>
+        <w:spacing w:before="0" w:after="140"/>
+        <w:rPr>
+          <w:b/>
+          <w:bCs/>
+        </w:rPr>
+      </w:pPr>
+      <w:r>
+        <w:rPr>
+          <w:b/>
+          <w:bCs/>
+        </w:rPr>
+      </w:r>
+      <w:r>
+        <w:br w:type="page"/>
+      </w:r>
+    </w:p>
+    <w:p>
+      <w:pPr>
+        <w:pStyle w:val="Heading1"/>
+        <w:numPr>
+          <w:ilvl w:val="0"/>
+          <w:numId w:val="2"/>
+        </w:numPr>
+        <w:spacing w:before="0" w:after="120"/>
+        <w:ind w:hanging="0" w:start="0"/>
+        <w:rPr/>
+      </w:pPr>
+      <w:bookmarkStart w:id="35" w:name="__RefHeading___Toc915_2335499624_Copy_1"/>
+      <w:bookmarkEnd w:id="35"/>
+      <w:r>
+        <w:rPr/>
+        <w:t>Appendix B: ICs mentioned</w:t>
+      </w:r>
+    </w:p>
+    <w:p>
+      <w:pPr>
+        <w:pStyle w:val="BodyText"/>
+        <w:spacing w:before="0" w:after="120"/>
+        <w:ind w:hanging="0" w:start="0"/>
+        <w:rPr>
+          <w:b/>
+          <w:bCs/>
+        </w:rPr>
+      </w:pPr>
+      <w:r>
+        <w:rPr>
+          <w:b/>
+          <w:bCs/>
+        </w:rPr>
+        <w:t xml:space="preserve">2114: </w:t>
+      </w:r>
+      <w:hyperlink r:id="rId12">
+        <w:r>
+          <w:rPr>
+            <w:rStyle w:val="Hyperlink"/>
+            <w:b w:val="false"/>
+            <w:bCs w:val="false"/>
+          </w:rPr>
+          <w:t>1k x 4 SRAM</w:t>
+        </w:r>
+      </w:hyperlink>
+    </w:p>
+    <w:p>
+      <w:pPr>
+        <w:pStyle w:val="BodyText"/>
+        <w:spacing w:before="0" w:after="120"/>
+        <w:ind w:hanging="0" w:start="0"/>
+        <w:rPr>
+          <w:b/>
+          <w:bCs/>
+        </w:rPr>
+      </w:pPr>
+      <w:r>
+        <w:rPr>
+          <w:b/>
+          <w:bCs/>
+        </w:rPr>
+        <w:t xml:space="preserve">2148: </w:t>
+      </w:r>
+      <w:hyperlink r:id="rId13">
+        <w:r>
+          <w:rPr>
+            <w:rStyle w:val="Hyperlink"/>
+            <w:b w:val="false"/>
+            <w:bCs w:val="false"/>
+          </w:rPr>
+          <w:t xml:space="preserve">1k x 4 </w:t>
+        </w:r>
+        <w:r>
+          <w:rPr>
+            <w:rStyle w:val="Hyperlink"/>
+            <w:b w:val="false"/>
+            <w:bCs w:val="false"/>
+          </w:rPr>
+          <w:t xml:space="preserve">High Speed </w:t>
+        </w:r>
+        <w:r>
+          <w:rPr>
+            <w:rStyle w:val="Hyperlink"/>
+            <w:b w:val="false"/>
+            <w:bCs w:val="false"/>
+          </w:rPr>
+          <w:t>SRAM</w:t>
+        </w:r>
+      </w:hyperlink>
+    </w:p>
+    <w:p>
+      <w:pPr>
+        <w:pStyle w:val="BodyText"/>
+        <w:spacing w:before="0" w:after="120"/>
+        <w:ind w:hanging="0" w:start="0"/>
+        <w:rPr>
+          <w:b/>
+          <w:bCs/>
+        </w:rPr>
+      </w:pPr>
+      <w:r>
+        <w:rPr>
+          <w:b/>
+          <w:bCs/>
+        </w:rPr>
+        <w:t xml:space="preserve">74LS08: </w:t>
+      </w:r>
+      <w:hyperlink r:id="rId14">
+        <w:r>
+          <w:rPr>
+            <w:rStyle w:val="Hyperlink"/>
+            <w:b w:val="false"/>
+            <w:bCs w:val="false"/>
+          </w:rPr>
+          <w:t>Quad 2-input AND gate</w:t>
+        </w:r>
+      </w:hyperlink>
+    </w:p>
+    <w:p>
+      <w:pPr>
+        <w:pStyle w:val="BodyText"/>
+        <w:spacing w:before="0" w:after="120"/>
+        <w:ind w:hanging="0" w:start="0"/>
+        <w:rPr>
+          <w:b/>
+          <w:bCs/>
+        </w:rPr>
+      </w:pPr>
+      <w:r>
+        <w:rPr>
+          <w:b/>
+          <w:bCs/>
+        </w:rPr>
+        <w:t xml:space="preserve">74LS32: </w:t>
+      </w:r>
+      <w:hyperlink r:id="rId15">
+        <w:r>
+          <w:rPr>
+            <w:rStyle w:val="Hyperlink"/>
+            <w:b w:val="false"/>
+            <w:bCs w:val="false"/>
+          </w:rPr>
+          <w:t>Quad 2-input OR gate</w:t>
+        </w:r>
+      </w:hyperlink>
+    </w:p>
+    <w:p>
+      <w:pPr>
+        <w:pStyle w:val="BodyText"/>
+        <w:spacing w:before="0" w:after="120"/>
+        <w:ind w:hanging="0" w:start="0"/>
+        <w:rPr>
+          <w:b/>
+          <w:bCs/>
+        </w:rPr>
+      </w:pPr>
+      <w:r>
+        <w:rPr>
+          <w:b/>
+          <w:bCs/>
+        </w:rPr>
+        <w:t xml:space="preserve">74LS138: </w:t>
+      </w:r>
+      <w:hyperlink r:id="rId16">
+        <w:r>
+          <w:rPr>
+            <w:rStyle w:val="Hyperlink"/>
+            <w:b w:val="false"/>
+            <w:bCs w:val="false"/>
+          </w:rPr>
+          <w:t>3-line to 8-line decoder/demultiplexer</w:t>
+        </w:r>
+      </w:hyperlink>
+    </w:p>
+    <w:p>
+      <w:pPr>
+        <w:pStyle w:val="BodyText"/>
+        <w:spacing w:before="0" w:after="120"/>
+        <w:ind w:hanging="0" w:start="0"/>
+        <w:rPr>
+          <w:b/>
+          <w:bCs/>
+        </w:rPr>
+      </w:pPr>
+      <w:r>
+        <w:rPr>
+          <w:b/>
+          <w:bCs/>
+        </w:rPr>
+        <w:t xml:space="preserve">74LS139: </w:t>
+      </w:r>
+      <w:hyperlink r:id="rId17">
+        <w:r>
+          <w:rPr>
+            <w:rStyle w:val="Hyperlink"/>
+            <w:b w:val="false"/>
+            <w:bCs w:val="false"/>
+          </w:rPr>
+          <w:t>Dual 2-line to 4-line decoder/demultiplexer</w:t>
+        </w:r>
+      </w:hyperlink>
+    </w:p>
+    <w:p>
+      <w:pPr>
+        <w:pStyle w:val="BodyText"/>
+        <w:spacing w:before="0" w:after="120"/>
+        <w:ind w:hanging="0" w:start="0"/>
+        <w:rPr>
+          <w:b/>
+          <w:bCs/>
+        </w:rPr>
+      </w:pPr>
+      <w:r>
+        <w:rPr>
+          <w:b/>
+          <w:bCs/>
+        </w:rPr>
+        <w:t xml:space="preserve">8257: </w:t>
+      </w:r>
+      <w:r>
+        <w:rPr>
+          <w:b w:val="false"/>
+          <w:bCs w:val="false"/>
+        </w:rPr>
+        <w:t>DMA Controller</w:t>
+      </w:r>
+    </w:p>
+    <w:p>
+      <w:pPr>
+        <w:pStyle w:val="BodyText"/>
+        <w:spacing w:before="0" w:after="120"/>
+        <w:ind w:hanging="0" w:start="0"/>
+        <w:rPr>
+          <w:b/>
+          <w:bCs/>
+        </w:rPr>
+      </w:pPr>
+      <w:r>
+        <w:rPr>
+          <w:b/>
+          <w:bCs/>
+        </w:rPr>
+        <w:t xml:space="preserve">Z80: </w:t>
+      </w:r>
+      <w:r>
+        <w:rPr>
+          <w:b w:val="false"/>
+          <w:bCs w:val="false"/>
+        </w:rPr>
+        <w:t>8-bit CPU</w:t>
+      </w:r>
+    </w:p>
     <w:sectPr>
-      <w:footerReference w:type="even" r:id="rId12"/>
-      <w:footerReference w:type="default" r:id="rId13"/>
-      <w:footerReference w:type="first" r:id="rId14"/>
+      <w:footerReference w:type="even" r:id="rId18"/>
+      <w:footerReference w:type="default" r:id="rId19"/>
+      <w:footerReference w:type="first" r:id="rId20"/>
       <w:type w:val="nextPage"/>
       <w:pgSz w:w="12240" w:h="15840"/>
       <w:pgMar w:left="1134" w:right="1134" w:gutter="0" w:header="0" w:top="1134" w:footer="756" w:bottom="1318"/>
@@ -7721,7 +8831,7 @@
       <w:tab/>
       <w:tab/>
     </w:r>
-    <w:bookmarkStart w:id="33" w:name="PageNumWizard_FOOTER_Default_Page_Style3"/>
+    <w:bookmarkStart w:id="36" w:name="PageNumWizard_FOOTER_Default_Page_Style3"/>
     <w:r>
       <w:rPr/>
       <w:fldChar w:fldCharType="begin"/>
@@ -7736,13 +8846,13 @@
     </w:r>
     <w:r>
       <w:rPr/>
-      <w:t>13</w:t>
+      <w:t>15</w:t>
     </w:r>
     <w:r>
       <w:rPr/>
       <w:fldChar w:fldCharType="end"/>
     </w:r>
-    <w:bookmarkEnd w:id="33"/>
+    <w:bookmarkEnd w:id="36"/>
   </w:p>
 </w:ftr>
 </file>
@@ -8421,6 +9531,13 @@
     <w:qFormat/>
     <w:rPr>
       <w:rFonts w:ascii="OpenSymbol" w:hAnsi="OpenSymbol" w:eastAsia="OpenSymbol" w:cs="OpenSymbol"/>
+    </w:rPr>
+  </w:style>
+  <w:style w:type="character" w:styleId="FollowedHyperlink">
+    <w:name w:val="FollowedHyperlink"/>
+    <w:rPr>
+      <w:color w:val="800000"/>
+      <w:u w:val="single"/>
     </w:rPr>
   </w:style>
   <w:style w:type="paragraph" w:styleId="Heading">

</xml_diff>